<commit_message>
Fix: Se ajustan las funciones de reemplazo de texto para que respete referencias cruzadas y formatos. Se ajusta funcion que agrega referencias cruzadas para figura y ahora se pone De la Figura XX a la Figura YY
</commit_message>
<xml_diff>
--- a/tests/doc_listo.docx
+++ b/tests/doc_listo.docx
@@ -24,23 +24,8 @@
           <w:lang w:val="es-MX"/>
         </w:rPr>
       </w:pPr>
-      <w:r>
-        <w:rPr>
-          <w:lang w:val="es-MX"/>
-        </w:rPr>
-      </w:r>
       <w:proofErr w:type="spellStart"/>
-      <w:r>
-        <w:rPr>
-          <w:lang w:val="es-MX"/>
-        </w:rPr>
-      </w:r>
       <w:proofErr w:type="spellEnd"/>
-      <w:r>
-        <w:rPr>
-          <w:lang w:val="es-MX"/>
-        </w:rPr>
-      </w:r>
       <w:r>
         <w:rPr/>
         <w:t>Estimado: BelloDev</w:t>
@@ -59,47 +44,10 @@
           <w:lang w:val="es-MX"/>
         </w:rPr>
       </w:pPr>
-      <w:r>
-        <w:rPr>
-          <w:lang w:val="es-MX"/>
-        </w:rPr>
-      </w:r>
-      <w:r>
-        <w:rPr>
-          <w:b/>
-          <w:bCs/>
-          <w:lang w:val="es-MX"/>
-        </w:rPr>
-      </w:r>
-      <w:r>
-        <w:rPr>
-          <w:lang w:val="es-MX"/>
-        </w:rPr>
-      </w:r>
       <w:proofErr w:type="spellStart"/>
-      <w:r>
-        <w:rPr>
-          <w:lang w:val="es-MX"/>
-        </w:rPr>
-      </w:r>
       <w:proofErr w:type="spellEnd"/>
-      <w:r>
-        <w:rPr>
-          <w:lang w:val="es-MX"/>
-        </w:rPr>
-      </w:r>
       <w:proofErr w:type="spellStart"/>
-      <w:r>
-        <w:rPr>
-          <w:lang w:val="es-MX"/>
-        </w:rPr>
-      </w:r>
       <w:proofErr w:type="spellEnd"/>
-      <w:r>
-        <w:rPr>
-          <w:lang w:val="es-MX"/>
-        </w:rPr>
-      </w:r>
       <w:r>
         <w:rPr/>
         <w:t xml:space="preserve">Ud. fue </w:t>
@@ -269,6 +217,7 @@
     </w:p>
     <w:p>
       <w:pPr>
+        <w:pStyle w:val="Figura"/>
         <w:spacing w:line="240" w:lineRule="auto"/>
         <w:jc w:val="center"/>
         <w:rPr>
@@ -279,21 +228,50 @@
         <w:rPr>
           <w:lang w:val="es-MX"/>
         </w:rPr>
-        <w:t>&lt;&lt;</w:t>
+        <w:drawing>
+          <wp:inline xmlns:a="http://schemas.openxmlformats.org/drawingml/2006/main" xmlns:pic="http://schemas.openxmlformats.org/drawingml/2006/picture">
+            <wp:extent cx="1828800" cy="2305878"/>
+            <wp:docPr id="1" name="Picture 1"/>
+            <wp:cNvGraphicFramePr>
+              <a:graphicFrameLocks noChangeAspect="1"/>
+            </wp:cNvGraphicFramePr>
+            <a:graphic>
+              <a:graphicData uri="http://schemas.openxmlformats.org/drawingml/2006/picture">
+                <pic:pic>
+                  <pic:nvPicPr>
+                    <pic:cNvPr id="0" name="fig_sec_1_1.jpg"/>
+                    <pic:cNvPicPr/>
+                  </pic:nvPicPr>
+                  <pic:blipFill>
+                    <a:blip r:embed="rId8"/>
+                    <a:stretch>
+                      <a:fillRect/>
+                    </a:stretch>
+                  </pic:blipFill>
+                  <pic:spPr>
+                    <a:xfrm>
+                      <a:off x="0" y="0"/>
+                      <a:ext cx="1828800" cy="2305878"/>
+                    </a:xfrm>
+                    <a:prstGeom prst="rect"/>
+                  </pic:spPr>
+                </pic:pic>
+              </a:graphicData>
+            </a:graphic>
+          </wp:inline>
+        </w:drawing>
       </w:r>
       <w:proofErr w:type="spellStart"/>
       <w:r>
         <w:rPr>
           <w:lang w:val="es-MX"/>
         </w:rPr>
-        <w:t>fig_sin_titulo</w:t>
       </w:r>
       <w:proofErr w:type="spellEnd"/>
       <w:r>
         <w:rPr>
           <w:lang w:val="es-MX"/>
         </w:rPr>
-        <w:t>&gt;&gt;</w:t>
       </w:r>
     </w:p>
     <w:p>
@@ -343,25 +321,41 @@
         <w:rPr>
           <w:lang w:val="es-MX"/>
         </w:rPr>
-        <w:t>Ahora sigue insertar la &lt;&lt;</w:t>
       </w:r>
       <w:proofErr w:type="spellStart"/>
       <w:r>
         <w:rPr>
           <w:lang w:val="es-MX"/>
         </w:rPr>
-        <w:t>reffigura_con_titulo</w:t>
       </w:r>
       <w:proofErr w:type="spellEnd"/>
       <w:r>
         <w:rPr>
           <w:lang w:val="es-MX"/>
         </w:rPr>
-        <w:t>&gt;&gt; la cual genera su título por el código.</w:t>
-      </w:r>
-    </w:p>
-    <w:p>
-      <w:pPr>
+      </w:r>
+      <w:r>
+        <w:t xml:space="preserve">Ahora sigue insertar la </w:t>
+      </w:r>
+      <w:r>
+        <w:t xml:space="preserve">Figura </w:t>
+      </w:r>
+      <w:r>
+        <w:fldChar w:fldCharType="begin"/>
+        <w:instrText xml:space="preserve"> REF &lt;&lt;RefFigura_con_titulo&gt;&gt; \h </w:instrText>
+        <w:fldChar w:fldCharType="separate"/>
+        <w:r>
+          <w:t>XX</w:t>
+        </w:r>
+        <w:fldChar w:fldCharType="end"/>
+      </w:r>
+      <w:r>
+        <w:t xml:space="preserve"> la cual genera su título por el código.</w:t>
+      </w:r>
+    </w:p>
+    <w:p>
+      <w:pPr>
+        <w:pStyle w:val="Figura"/>
         <w:spacing w:line="240" w:lineRule="auto"/>
         <w:jc w:val="center"/>
         <w:rPr>
@@ -372,137 +366,225 @@
         <w:rPr>
           <w:lang w:val="es-MX"/>
         </w:rPr>
-        <w:t>&lt;&lt;</w:t>
+        <w:drawing>
+          <wp:inline xmlns:a="http://schemas.openxmlformats.org/drawingml/2006/main" xmlns:pic="http://schemas.openxmlformats.org/drawingml/2006/picture">
+            <wp:extent cx="1828800" cy="2305878"/>
+            <wp:docPr id="2" name="Picture 2"/>
+            <wp:cNvGraphicFramePr>
+              <a:graphicFrameLocks noChangeAspect="1"/>
+            </wp:cNvGraphicFramePr>
+            <a:graphic>
+              <a:graphicData uri="http://schemas.openxmlformats.org/drawingml/2006/picture">
+                <pic:pic>
+                  <pic:nvPicPr>
+                    <pic:cNvPr id="0" name="fig_sec_1_1.jpg"/>
+                    <pic:cNvPicPr/>
+                  </pic:nvPicPr>
+                  <pic:blipFill>
+                    <a:blip r:embed="rId8"/>
+                    <a:stretch>
+                      <a:fillRect/>
+                    </a:stretch>
+                  </pic:blipFill>
+                  <pic:spPr>
+                    <a:xfrm>
+                      <a:off x="0" y="0"/>
+                      <a:ext cx="1828800" cy="2305878"/>
+                    </a:xfrm>
+                    <a:prstGeom prst="rect"/>
+                  </pic:spPr>
+                </pic:pic>
+              </a:graphicData>
+            </a:graphic>
+          </wp:inline>
+        </w:drawing>
       </w:r>
       <w:proofErr w:type="spellStart"/>
       <w:r>
         <w:rPr>
           <w:lang w:val="es-MX"/>
         </w:rPr>
-        <w:t>fig_con_titulo</w:t>
       </w:r>
       <w:proofErr w:type="spellEnd"/>
       <w:r>
         <w:rPr>
           <w:lang w:val="es-MX"/>
         </w:rPr>
-        <w:t>&gt;&gt;</w:t>
-      </w:r>
-    </w:p>
+      </w:r>
+    </w:p>
+    <w:p>
+      <w:pPr>
+        <w:pStyle w:val="Carcentrado"/>
+      </w:pPr>
+      <w:r>
+        <w:t xml:space="preserve">Figura </w:t>
+      </w:r>
+      <w:bookmarkStart w:id="5080" w:name="&lt;&lt;RefFigura_con_titulo&gt;&gt;"/>
+      <w:r>
+        <w:fldChar w:fldCharType="begin"/>
+      </w:r>
+      <w:r>
+        <w:instrText xml:space="preserve"> SEQ Figura \* ARABIC </w:instrText>
+      </w:r>
+      <w:r>
+        <w:fldChar w:fldCharType="separate"/>
+      </w:r>
+      <w:r>
+        <w:t>1</w:t>
+      </w:r>
+      <w:r>
+        <w:fldChar w:fldCharType="end"/>
+      </w:r>
+      <w:bookmarkEnd w:id="5080"/>
+      <w:r>
+        <w:t xml:space="preserve">. Se ve la carita de una niña</w:t>
+      </w:r>
+    </w:p>
+    <w:p/>
     <w:p>
       <w:pPr>
         <w:spacing w:line="240" w:lineRule="auto"/>
         <w:rPr>
-          <w:lang w:val="es-MX"/>
-        </w:rPr>
-      </w:pPr>
-      <w:r>
-        <w:rPr>
-          <w:lang w:val="es-MX"/>
-        </w:rPr>
-        <w:t xml:space="preserve">Recuerda que la </w:t>
+          <w:u w:val="single"/>
+          <w:lang w:val="es-MX"/>
+        </w:rPr>
+      </w:pPr>
+      <w:r>
+        <w:rPr>
+          <w:lang w:val="es-MX"/>
+        </w:rPr>
       </w:r>
       <w:proofErr w:type="spellStart"/>
       <w:r>
         <w:rPr>
           <w:lang w:val="es-MX"/>
         </w:rPr>
-        <w:t>la</w:t>
       </w:r>
       <w:proofErr w:type="spellEnd"/>
       <w:r>
         <w:rPr>
           <w:lang w:val="es-MX"/>
         </w:rPr>
-        <w:t xml:space="preserve"> variable que lleva la figura debe tener el “mismo” nombre que la referencia. El iniciador de la figura es </w:t>
-      </w:r>
-      <w:r>
-        <w:rPr>
-          <w:lang w:val="es-MX"/>
-        </w:rPr>
-        <w:t>&lt;&lt;</w:t>
+      </w:r>
+      <w:r>
+        <w:rPr>
+          <w:lang w:val="es-MX"/>
+        </w:rPr>
       </w:r>
       <w:proofErr w:type="spellStart"/>
       <w:r>
         <w:rPr>
           <w:lang w:val="es-MX"/>
         </w:rPr>
-        <w:t>fig</w:t>
       </w:r>
       <w:proofErr w:type="spellEnd"/>
       <w:r>
         <w:rPr>
           <w:lang w:val="es-MX"/>
         </w:rPr>
-        <w:t xml:space="preserve">_ y </w:t>
       </w:r>
       <w:proofErr w:type="spellStart"/>
       <w:r>
         <w:rPr>
           <w:lang w:val="es-MX"/>
         </w:rPr>
-        <w:t>lueg</w:t>
       </w:r>
       <w:proofErr w:type="spellEnd"/>
       <w:r>
         <w:rPr>
           <w:lang w:val="es-MX"/>
         </w:rPr>
-        <w:t xml:space="preserve"> sigue “</w:t>
       </w:r>
       <w:proofErr w:type="spellStart"/>
       <w:r>
         <w:rPr>
           <w:lang w:val="es-MX"/>
         </w:rPr>
-        <w:t>nombredelafigura</w:t>
       </w:r>
       <w:proofErr w:type="spellEnd"/>
       <w:r>
         <w:rPr>
           <w:lang w:val="es-MX"/>
         </w:rPr>
-        <w:t xml:space="preserve">”, ese mismo nombre considerando mayúsculas y minúsculas debe estar en la referencia; pero la referencia inicia con </w:t>
-      </w:r>
-      <w:r>
-        <w:rPr>
-          <w:lang w:val="es-MX"/>
-        </w:rPr>
-        <w:t>&lt;</w:t>
-      </w:r>
-      <w:r>
-        <w:rPr>
-          <w:lang w:val="es-MX"/>
-        </w:rPr>
-        <w:t>&lt;</w:t>
+      </w:r>
+      <w:r>
+        <w:rPr>
+          <w:lang w:val="es-MX"/>
+        </w:rPr>
+      </w:r>
+      <w:r>
+        <w:rPr>
+          <w:lang w:val="es-MX"/>
+        </w:rPr>
       </w:r>
       <w:proofErr w:type="spellStart"/>
       <w:r>
         <w:rPr>
           <w:lang w:val="es-MX"/>
         </w:rPr>
-        <w:t>reffigura</w:t>
       </w:r>
       <w:proofErr w:type="spellEnd"/>
       <w:r>
         <w:rPr>
           <w:lang w:val="es-MX"/>
         </w:rPr>
-        <w:t>_ luego sigue “</w:t>
       </w:r>
       <w:proofErr w:type="spellStart"/>
       <w:r>
         <w:rPr>
           <w:lang w:val="es-MX"/>
         </w:rPr>
-        <w:t>nombredelafigura</w:t>
       </w:r>
       <w:proofErr w:type="spellEnd"/>
       <w:r>
         <w:rPr>
           <w:lang w:val="es-MX"/>
         </w:rPr>
-        <w:t>”.</w:t>
+      </w:r>
+      <w:r>
+        <w:rPr>
+          <w:lang w:val="es-MX"/>
+        </w:rPr>
+      </w:r>
+      <w:r>
+        <w:rPr>
+          <w:lang w:val="es-MX"/>
+        </w:rPr>
+      </w:r>
+      <w:proofErr w:type="spellStart"/>
+      <w:r>
+        <w:rPr>
+          <w:lang w:val="es-MX"/>
+        </w:rPr>
+      </w:r>
+      <w:proofErr w:type="spellEnd"/>
+      <w:r>
+        <w:rPr>
+          <w:lang w:val="es-MX"/>
+        </w:rPr>
+      </w:r>
+      <w:r>
+        <w:rPr>
+          <w:lang w:val="es-MX"/>
+        </w:rPr>
+      </w:r>
+      <w:r>
+        <w:t xml:space="preserve">Recuerda que la la variable que lleva la figura debe tener el “mismo” nombre que la referencia. El iniciador de la figura es &lt;&lt;fig_ y lueg sigue “nombredelafigura”, ese mismo nombre considerando mayúsculas y minúsculas debe estar en la referencia; pero la referencia inicia con &lt;&lt;reffigura_ luego sigue “nombredelafigura”. Puedes ver a lo que me refiero con esta referencia </w:t>
+      </w:r>
+      <w:r>
+        <w:t xml:space="preserve">Figura </w:t>
+      </w:r>
+      <w:r>
+        <w:fldChar w:fldCharType="begin"/>
+        <w:instrText xml:space="preserve"> REF &lt;&lt;RefFigura_con_titulo&gt;&gt; \h </w:instrText>
+        <w:fldChar w:fldCharType="separate"/>
+        <w:r>
+          <w:t>XX</w:t>
+        </w:r>
+        <w:fldChar w:fldCharType="end"/>
+      </w:r>
+      <w:r>
+        <w:t>.</w:t>
       </w:r>
     </w:p>
     <w:p>
@@ -550,7 +632,7 @@
       <w:r>
         <w:t xml:space="preserve">Tabla </w:t>
       </w:r>
-      <w:bookmarkStart w:id="668775" w:name="RefTabla_Resultados_1"/>
+      <w:bookmarkStart w:id="56437" w:name="RefTabla_Resultados_1"/>
       <w:r>
         <w:fldChar w:fldCharType="begin"/>
       </w:r>
@@ -566,7 +648,7 @@
       <w:r>
         <w:fldChar w:fldCharType="end"/>
       </w:r>
-      <w:bookmarkEnd w:id="668775"/>
+      <w:bookmarkEnd w:id="56437"/>
       <w:r>
         <w:t xml:space="preserve">. Resultados del análisis</w:t>
       </w:r>
@@ -745,7 +827,7 @@
         <w:pStyle w:val="subtitulo"/>
       </w:pPr>
       <w:r>
-        <w:t>&lt;&lt;titulo_1&gt;&gt;</w:t>
+        <w:t>Resultados de la sección 1.</w:t>
       </w:r>
       <w:proofErr w:type="spellStart"/>
       <w:r/>
@@ -759,7 +841,7 @@
     <w:p>
       <w:pPr/>
       <w:r>
-        <w:t>&lt;&lt;contenido_1&gt;&gt;</w:t>
+        <w:t>En esta sección se muestran los resultados obtenidos en el experimento 1.</w:t>
       </w:r>
     </w:p>
     <w:p>
@@ -769,7 +851,7 @@
     <w:p>
       <w:pPr/>
       <w:r>
-        <w:t>&lt;&lt;contenido_1_parte2&gt;&gt;</w:t>
+        <w:t>Además, se observa que los resultados son consistentes con lo esperado.</w:t>
       </w:r>
     </w:p>
     <w:p>
@@ -778,8 +860,36 @@
     </w:p>
     <w:p>
       <w:pPr/>
-      <w:r>
-        <w:t>De la &lt;&lt;reffigura_sec_1&gt;&gt; se muestran resultados interesantes.</w:t>
+      <w:r/>
+      <w:r>
+        <w:t xml:space="preserve">De la </w:t>
+      </w:r>
+      <w:r>
+        <w:t xml:space="preserve">Figura </w:t>
+      </w:r>
+      <w:r>
+        <w:fldChar w:fldCharType="begin"/>
+        <w:instrText xml:space="preserve"> REF &lt;&lt;RefFigura_sec_1_1&gt;&gt; \h </w:instrText>
+        <w:fldChar w:fldCharType="separate"/>
+        <w:r>
+          <w:t>XX</w:t>
+        </w:r>
+        <w:fldChar w:fldCharType="end"/>
+      </w:r>
+      <w:r>
+        <w:t xml:space="preserve"> a la </w:t>
+      </w:r>
+      <w:r>
+        <w:fldChar w:fldCharType="begin"/>
+        <w:instrText xml:space="preserve"> REF &lt;&lt;RefFigura_sec_1_3&gt;&gt; \h </w:instrText>
+        <w:fldChar w:fldCharType="separate"/>
+        <w:r>
+          <w:t>XX</w:t>
+        </w:r>
+        <w:fldChar w:fldCharType="end"/>
+      </w:r>
+      <w:r>
+        <w:t xml:space="preserve"> se muestran resultados interesantes.</w:t>
       </w:r>
     </w:p>
     <w:p>
@@ -787,17 +897,215 @@
       <w:r/>
     </w:p>
     <w:p>
-      <w:pPr/>
-      <w:r>
-        <w:t>&lt;&lt;fig_sec_1&gt;&gt;</w:t>
-      </w:r>
-    </w:p>
+      <w:pPr>
+        <w:pStyle w:val="Figura"/>
+      </w:pPr>
+      <w:r>
+        <w:drawing>
+          <wp:inline xmlns:a="http://schemas.openxmlformats.org/drawingml/2006/main" xmlns:pic="http://schemas.openxmlformats.org/drawingml/2006/picture">
+            <wp:extent cx="1828800" cy="2305878"/>
+            <wp:docPr id="3" name="Picture 3"/>
+            <wp:cNvGraphicFramePr>
+              <a:graphicFrameLocks noChangeAspect="1"/>
+            </wp:cNvGraphicFramePr>
+            <a:graphic>
+              <a:graphicData uri="http://schemas.openxmlformats.org/drawingml/2006/picture">
+                <pic:pic>
+                  <pic:nvPicPr>
+                    <pic:cNvPr id="0" name="fig_sec_1_1.jpg"/>
+                    <pic:cNvPicPr/>
+                  </pic:nvPicPr>
+                  <pic:blipFill>
+                    <a:blip r:embed="rId8"/>
+                    <a:stretch>
+                      <a:fillRect/>
+                    </a:stretch>
+                  </pic:blipFill>
+                  <pic:spPr>
+                    <a:xfrm>
+                      <a:off x="0" y="0"/>
+                      <a:ext cx="1828800" cy="2305878"/>
+                    </a:xfrm>
+                    <a:prstGeom prst="rect"/>
+                  </pic:spPr>
+                </pic:pic>
+              </a:graphicData>
+            </a:graphic>
+          </wp:inline>
+        </w:drawing>
+      </w:r>
+    </w:p>
+    <w:p>
+      <w:pPr>
+        <w:pStyle w:val="Carcentrado"/>
+      </w:pPr>
+      <w:r>
+        <w:t xml:space="preserve">Figura </w:t>
+      </w:r>
+      <w:bookmarkStart w:id="846228" w:name="&lt;&lt;RefFigura_sec_1_1&gt;&gt;"/>
+      <w:r>
+        <w:fldChar w:fldCharType="begin"/>
+      </w:r>
+      <w:r>
+        <w:instrText xml:space="preserve"> SEQ Figura \* ARABIC </w:instrText>
+      </w:r>
+      <w:r>
+        <w:fldChar w:fldCharType="separate"/>
+      </w:r>
+      <w:r>
+        <w:t>1</w:t>
+      </w:r>
+      <w:r>
+        <w:fldChar w:fldCharType="end"/>
+      </w:r>
+      <w:bookmarkEnd w:id="846228"/>
+      <w:r>
+        <w:t xml:space="preserve">. Momardo 1-1</w:t>
+      </w:r>
+    </w:p>
+    <w:p/>
+    <w:p>
+      <w:pPr>
+        <w:pStyle w:val="Figura"/>
+      </w:pPr>
+      <w:r>
+        <w:drawing>
+          <wp:inline xmlns:a="http://schemas.openxmlformats.org/drawingml/2006/main" xmlns:pic="http://schemas.openxmlformats.org/drawingml/2006/picture">
+            <wp:extent cx="1828800" cy="2133600"/>
+            <wp:docPr id="4" name="Picture 4"/>
+            <wp:cNvGraphicFramePr>
+              <a:graphicFrameLocks noChangeAspect="1"/>
+            </wp:cNvGraphicFramePr>
+            <a:graphic>
+              <a:graphicData uri="http://schemas.openxmlformats.org/drawingml/2006/picture">
+                <pic:pic>
+                  <pic:nvPicPr>
+                    <pic:cNvPr id="0" name="fig_sec_1_2.jpg"/>
+                    <pic:cNvPicPr/>
+                  </pic:nvPicPr>
+                  <pic:blipFill>
+                    <a:blip r:embed="rId9"/>
+                    <a:stretch>
+                      <a:fillRect/>
+                    </a:stretch>
+                  </pic:blipFill>
+                  <pic:spPr>
+                    <a:xfrm>
+                      <a:off x="0" y="0"/>
+                      <a:ext cx="1828800" cy="2133600"/>
+                    </a:xfrm>
+                    <a:prstGeom prst="rect"/>
+                  </pic:spPr>
+                </pic:pic>
+              </a:graphicData>
+            </a:graphic>
+          </wp:inline>
+        </w:drawing>
+      </w:r>
+    </w:p>
+    <w:p>
+      <w:pPr>
+        <w:pStyle w:val="Carcentrado"/>
+      </w:pPr>
+      <w:r>
+        <w:t xml:space="preserve">Figura </w:t>
+      </w:r>
+      <w:bookmarkStart w:id="530982" w:name="&lt;&lt;RefFigura_sec_1_2&gt;&gt;"/>
+      <w:r>
+        <w:fldChar w:fldCharType="begin"/>
+      </w:r>
+      <w:r>
+        <w:instrText xml:space="preserve"> SEQ Figura \* ARABIC </w:instrText>
+      </w:r>
+      <w:r>
+        <w:fldChar w:fldCharType="separate"/>
+      </w:r>
+      <w:r>
+        <w:t>1</w:t>
+      </w:r>
+      <w:r>
+        <w:fldChar w:fldCharType="end"/>
+      </w:r>
+      <w:bookmarkEnd w:id="530982"/>
+      <w:r>
+        <w:t xml:space="preserve">. Momardo 1-2</w:t>
+      </w:r>
+    </w:p>
+    <w:p/>
+    <w:p>
+      <w:pPr>
+        <w:pStyle w:val="Figura"/>
+      </w:pPr>
+      <w:r>
+        <w:drawing>
+          <wp:inline xmlns:a="http://schemas.openxmlformats.org/drawingml/2006/main" xmlns:pic="http://schemas.openxmlformats.org/drawingml/2006/picture">
+            <wp:extent cx="1828800" cy="2373549"/>
+            <wp:docPr id="5" name="Picture 5"/>
+            <wp:cNvGraphicFramePr>
+              <a:graphicFrameLocks noChangeAspect="1"/>
+            </wp:cNvGraphicFramePr>
+            <a:graphic>
+              <a:graphicData uri="http://schemas.openxmlformats.org/drawingml/2006/picture">
+                <pic:pic>
+                  <pic:nvPicPr>
+                    <pic:cNvPr id="0" name="fig_sec_1_3.jpg"/>
+                    <pic:cNvPicPr/>
+                  </pic:nvPicPr>
+                  <pic:blipFill>
+                    <a:blip r:embed="rId10"/>
+                    <a:stretch>
+                      <a:fillRect/>
+                    </a:stretch>
+                  </pic:blipFill>
+                  <pic:spPr>
+                    <a:xfrm>
+                      <a:off x="0" y="0"/>
+                      <a:ext cx="1828800" cy="2373549"/>
+                    </a:xfrm>
+                    <a:prstGeom prst="rect"/>
+                  </pic:spPr>
+                </pic:pic>
+              </a:graphicData>
+            </a:graphic>
+          </wp:inline>
+        </w:drawing>
+      </w:r>
+    </w:p>
+    <w:p>
+      <w:pPr>
+        <w:pStyle w:val="Carcentrado"/>
+      </w:pPr>
+      <w:r>
+        <w:t xml:space="preserve">Figura </w:t>
+      </w:r>
+      <w:bookmarkStart w:id="644517" w:name="&lt;&lt;RefFigura_sec_1_3&gt;&gt;"/>
+      <w:r>
+        <w:fldChar w:fldCharType="begin"/>
+      </w:r>
+      <w:r>
+        <w:instrText xml:space="preserve"> SEQ Figura \* ARABIC </w:instrText>
+      </w:r>
+      <w:r>
+        <w:fldChar w:fldCharType="separate"/>
+      </w:r>
+      <w:r>
+        <w:t>1</w:t>
+      </w:r>
+      <w:r>
+        <w:fldChar w:fldCharType="end"/>
+      </w:r>
+      <w:bookmarkEnd w:id="644517"/>
+      <w:r>
+        <w:t xml:space="preserve">. Momardo 1-3</w:t>
+      </w:r>
+    </w:p>
+    <w:p/>
     <w:p>
       <w:pPr>
         <w:pStyle w:val="subtitulo"/>
       </w:pPr>
       <w:r>
-        <w:t>&lt;&lt;titulo_2&gt;&gt;</w:t>
+        <w:t>Resultados de la sección 2.</w:t>
       </w:r>
     </w:p>
     <w:p>
@@ -807,7 +1115,7 @@
     <w:p>
       <w:pPr/>
       <w:r>
-        <w:t>&lt;&lt;contenido_2&gt;&gt;</w:t>
+        <w:t>En esta sección se muestran los resultados obtenidos en el experimento 2.</w:t>
       </w:r>
     </w:p>
     <w:p>
@@ -816,8 +1124,36 @@
     </w:p>
     <w:p>
       <w:pPr/>
-      <w:r>
-        <w:t>De la &lt;&lt;reffigura_sec_2&gt;&gt; se muestran más resultados interesantes.</w:t>
+      <w:r/>
+      <w:r>
+        <w:t xml:space="preserve">De la </w:t>
+      </w:r>
+      <w:r>
+        <w:t xml:space="preserve">Figura </w:t>
+      </w:r>
+      <w:r>
+        <w:fldChar w:fldCharType="begin"/>
+        <w:instrText xml:space="preserve"> REF &lt;&lt;RefFigura_sec_2_1&gt;&gt; \h </w:instrText>
+        <w:fldChar w:fldCharType="separate"/>
+        <w:r>
+          <w:t>XX</w:t>
+        </w:r>
+        <w:fldChar w:fldCharType="end"/>
+      </w:r>
+      <w:r>
+        <w:t xml:space="preserve"> a la </w:t>
+      </w:r>
+      <w:r>
+        <w:fldChar w:fldCharType="begin"/>
+        <w:instrText xml:space="preserve"> REF &lt;&lt;RefFigura_sec_2_3&gt;&gt; \h </w:instrText>
+        <w:fldChar w:fldCharType="separate"/>
+        <w:r>
+          <w:t>XX</w:t>
+        </w:r>
+        <w:fldChar w:fldCharType="end"/>
+      </w:r>
+      <w:r>
+        <w:t xml:space="preserve"> se muestran más resultados interesantes.</w:t>
       </w:r>
     </w:p>
     <w:p>
@@ -825,13 +1161,374 @@
       <w:r/>
     </w:p>
     <w:p>
-      <w:pPr/>
-      <w:r>
-        <w:t>&lt;&lt;fig_sec_2&gt;&gt;</w:t>
+      <w:pPr>
+        <w:pStyle w:val="Figura"/>
+      </w:pPr>
+      <w:r>
+        <w:drawing>
+          <wp:inline xmlns:a="http://schemas.openxmlformats.org/drawingml/2006/main" xmlns:pic="http://schemas.openxmlformats.org/drawingml/2006/picture">
+            <wp:extent cx="1828800" cy="1964267"/>
+            <wp:docPr id="6" name="Picture 6"/>
+            <wp:cNvGraphicFramePr>
+              <a:graphicFrameLocks noChangeAspect="1"/>
+            </wp:cNvGraphicFramePr>
+            <a:graphic>
+              <a:graphicData uri="http://schemas.openxmlformats.org/drawingml/2006/picture">
+                <pic:pic>
+                  <pic:nvPicPr>
+                    <pic:cNvPr id="0" name="fig_sec_2_1.jpg"/>
+                    <pic:cNvPicPr/>
+                  </pic:nvPicPr>
+                  <pic:blipFill>
+                    <a:blip r:embed="rId11"/>
+                    <a:stretch>
+                      <a:fillRect/>
+                    </a:stretch>
+                  </pic:blipFill>
+                  <pic:spPr>
+                    <a:xfrm>
+                      <a:off x="0" y="0"/>
+                      <a:ext cx="1828800" cy="1964267"/>
+                    </a:xfrm>
+                    <a:prstGeom prst="rect"/>
+                  </pic:spPr>
+                </pic:pic>
+              </a:graphicData>
+            </a:graphic>
+          </wp:inline>
+        </w:drawing>
+      </w:r>
+    </w:p>
+    <w:p>
+      <w:pPr>
+        <w:pStyle w:val="Carcentrado"/>
+      </w:pPr>
+      <w:r>
+        <w:t xml:space="preserve">Figura </w:t>
+      </w:r>
+      <w:bookmarkStart w:id="949275" w:name="&lt;&lt;RefFigura_sec_2_1&gt;&gt;"/>
+      <w:r>
+        <w:fldChar w:fldCharType="begin"/>
+      </w:r>
+      <w:r>
+        <w:instrText xml:space="preserve"> SEQ Figura \* ARABIC </w:instrText>
+      </w:r>
+      <w:r>
+        <w:fldChar w:fldCharType="separate"/>
+      </w:r>
+      <w:r>
+        <w:t>1</w:t>
+      </w:r>
+      <w:r>
+        <w:fldChar w:fldCharType="end"/>
+      </w:r>
+      <w:bookmarkEnd w:id="949275"/>
+      <w:r>
+        <w:t xml:space="preserve">. Momardo 2-1</w:t>
+      </w:r>
+    </w:p>
+    <w:p/>
+    <w:p>
+      <w:pPr>
+        <w:pStyle w:val="Figura"/>
+      </w:pPr>
+      <w:r>
+        <w:drawing>
+          <wp:inline xmlns:a="http://schemas.openxmlformats.org/drawingml/2006/main" xmlns:pic="http://schemas.openxmlformats.org/drawingml/2006/picture">
+            <wp:extent cx="1828800" cy="1033670"/>
+            <wp:docPr id="7" name="Picture 7"/>
+            <wp:cNvGraphicFramePr>
+              <a:graphicFrameLocks noChangeAspect="1"/>
+            </wp:cNvGraphicFramePr>
+            <a:graphic>
+              <a:graphicData uri="http://schemas.openxmlformats.org/drawingml/2006/picture">
+                <pic:pic>
+                  <pic:nvPicPr>
+                    <pic:cNvPr id="0" name="fig_sec_2_2.jpg"/>
+                    <pic:cNvPicPr/>
+                  </pic:nvPicPr>
+                  <pic:blipFill>
+                    <a:blip r:embed="rId12"/>
+                    <a:stretch>
+                      <a:fillRect/>
+                    </a:stretch>
+                  </pic:blipFill>
+                  <pic:spPr>
+                    <a:xfrm>
+                      <a:off x="0" y="0"/>
+                      <a:ext cx="1828800" cy="1033670"/>
+                    </a:xfrm>
+                    <a:prstGeom prst="rect"/>
+                  </pic:spPr>
+                </pic:pic>
+              </a:graphicData>
+            </a:graphic>
+          </wp:inline>
+        </w:drawing>
+      </w:r>
+    </w:p>
+    <w:p>
+      <w:pPr>
+        <w:pStyle w:val="Carcentrado"/>
+      </w:pPr>
+      <w:r>
+        <w:t xml:space="preserve">Figura </w:t>
+      </w:r>
+      <w:bookmarkStart w:id="528176" w:name="&lt;&lt;RefFigura_sec_2_2&gt;&gt;"/>
+      <w:r>
+        <w:fldChar w:fldCharType="begin"/>
+      </w:r>
+      <w:r>
+        <w:instrText xml:space="preserve"> SEQ Figura \* ARABIC </w:instrText>
+      </w:r>
+      <w:r>
+        <w:fldChar w:fldCharType="separate"/>
+      </w:r>
+      <w:r>
+        <w:t>1</w:t>
+      </w:r>
+      <w:r>
+        <w:fldChar w:fldCharType="end"/>
+      </w:r>
+      <w:bookmarkEnd w:id="528176"/>
+      <w:r>
+        <w:t xml:space="preserve">. Momardo 2-2</w:t>
+      </w:r>
+    </w:p>
+    <w:p/>
+    <w:p>
+      <w:pPr>
+        <w:pStyle w:val="Figura"/>
+      </w:pPr>
+      <w:r>
+        <w:drawing>
+          <wp:inline xmlns:a="http://schemas.openxmlformats.org/drawingml/2006/main" xmlns:pic="http://schemas.openxmlformats.org/drawingml/2006/picture">
+            <wp:extent cx="1828800" cy="1925053"/>
+            <wp:docPr id="8" name="Picture 8"/>
+            <wp:cNvGraphicFramePr>
+              <a:graphicFrameLocks noChangeAspect="1"/>
+            </wp:cNvGraphicFramePr>
+            <a:graphic>
+              <a:graphicData uri="http://schemas.openxmlformats.org/drawingml/2006/picture">
+                <pic:pic>
+                  <pic:nvPicPr>
+                    <pic:cNvPr id="0" name="fig_sec_2_3.jpg"/>
+                    <pic:cNvPicPr/>
+                  </pic:nvPicPr>
+                  <pic:blipFill>
+                    <a:blip r:embed="rId13"/>
+                    <a:stretch>
+                      <a:fillRect/>
+                    </a:stretch>
+                  </pic:blipFill>
+                  <pic:spPr>
+                    <a:xfrm>
+                      <a:off x="0" y="0"/>
+                      <a:ext cx="1828800" cy="1925053"/>
+                    </a:xfrm>
+                    <a:prstGeom prst="rect"/>
+                  </pic:spPr>
+                </pic:pic>
+              </a:graphicData>
+            </a:graphic>
+          </wp:inline>
+        </w:drawing>
+      </w:r>
+    </w:p>
+    <w:p>
+      <w:pPr>
+        <w:pStyle w:val="Carcentrado"/>
+      </w:pPr>
+      <w:r>
+        <w:t xml:space="preserve">Figura </w:t>
+      </w:r>
+      <w:bookmarkStart w:id="154465" w:name="&lt;&lt;RefFigura_sec_2_3&gt;&gt;"/>
+      <w:r>
+        <w:fldChar w:fldCharType="begin"/>
+      </w:r>
+      <w:r>
+        <w:instrText xml:space="preserve"> SEQ Figura \* ARABIC </w:instrText>
+      </w:r>
+      <w:r>
+        <w:fldChar w:fldCharType="separate"/>
+      </w:r>
+      <w:r>
+        <w:t>1</w:t>
+      </w:r>
+      <w:r>
+        <w:fldChar w:fldCharType="end"/>
+      </w:r>
+      <w:bookmarkEnd w:id="154465"/>
+      <w:r>
+        <w:t xml:space="preserve">. Momardo 2-3</w:t>
       </w:r>
     </w:p>
     <w:p/>
     <w:p/>
+    <w:p/>
+    <w:p>
+      <w:pPr>
+        <w:rPr>
+          <w:lang w:val="es-MX"/>
+        </w:rPr>
+      </w:pPr>
+      <w:r>
+        <w:t xml:space="preserve">Ahora, probaremos textos con estilos insertados. El día de </w:t>
+      </w:r>
+      <w:r>
+        <w:rPr>
+          <w:lang w:val="es-MX"/>
+        </w:rPr>
+        <w:t xml:space="preserve">03 de junio de 2026 tengo ganas de poner unas letras en </w:t>
+      </w:r>
+      <w:r>
+        <w:rPr>
+          <w:b/>
+          <w:bCs/>
+          <w:lang w:val="es-MX"/>
+        </w:rPr>
+        <w:t>negrita</w:t>
+      </w:r>
+      <w:r>
+        <w:rPr>
+          <w:lang w:val="es-MX"/>
+        </w:rPr>
+        <w:t xml:space="preserve"> y otras en </w:t>
+      </w:r>
+      <w:r>
+        <w:rPr>
+          <w:i/>
+          <w:iCs/>
+          <w:lang w:val="es-MX"/>
+        </w:rPr>
+        <w:t>cursiva</w:t>
+      </w:r>
+      <w:r>
+        <w:rPr>
+          <w:lang w:val="es-MX"/>
+        </w:rPr>
+        <w:t>. El texto en negrita y cursiva debe mantenerse sin cambios de estilo.</w:t>
+      </w:r>
+    </w:p>
+    <w:p>
+      <w:pPr>
+        <w:rPr>
+          <w:lang w:val="es-MX"/>
+        </w:rPr>
+      </w:pPr>
+    </w:p>
+    <w:p>
+      <w:pPr>
+        <w:rPr>
+          <w:lang w:val="es-MX"/>
+        </w:rPr>
+      </w:pPr>
+      <w:r>
+        <w:rPr>
+          <w:lang w:val="es-MX"/>
+        </w:rPr>
+        <w:t>A continuación, se prueba que</w:t>
+      </w:r>
+      <w:r>
+        <w:rPr>
+          <w:lang w:val="es-MX"/>
+        </w:rPr>
+        <w:t xml:space="preserve"> al insertar varias variables</w:t>
+      </w:r>
+      <w:r>
+        <w:rPr>
+          <w:lang w:val="es-MX"/>
+        </w:rPr>
+        <w:t xml:space="preserve"> se mantengan las referencias cruzadas</w:t>
+      </w:r>
+      <w:r>
+        <w:rPr>
+          <w:lang w:val="es-MX"/>
+        </w:rPr>
+        <w:t xml:space="preserve"> (ver más en </w:t>
+      </w:r>
+      <w:r>
+        <w:rPr>
+          <w:lang w:val="es-MX"/>
+        </w:rPr>
+        <w:fldChar w:fldCharType="begin"/>
+      </w:r>
+      <w:r>
+        <w:rPr>
+          <w:lang w:val="es-MX"/>
+        </w:rPr>
+        <w:instrText xml:space="preserve"> REF _Ref241232871 \h </w:instrText>
+      </w:r>
+      <w:r>
+        <w:rPr>
+          <w:lang w:val="es-MX"/>
+        </w:rPr>
+      </w:r>
+      <w:r>
+        <w:rPr>
+          <w:lang w:val="es-MX"/>
+        </w:rPr>
+        <w:fldChar w:fldCharType="separate"/>
+      </w:r>
+      <w:r>
+        <w:rPr>
+          <w:lang w:val="es-MX"/>
+        </w:rPr>
+        <w:t>Título de sección</w:t>
+      </w:r>
+      <w:r>
+        <w:rPr>
+          <w:lang w:val="es-MX"/>
+        </w:rPr>
+        <w:fldChar w:fldCharType="end"/>
+      </w:r>
+      <w:proofErr w:type="spellStart"/>
+      <w:proofErr w:type="spellEnd"/>
+      <w:r>
+        <w:rPr/>
+        <w:t>). En día 03 de junio de 2026 se observó que el 2026 fue muy caluroso.</w:t>
+      </w:r>
+    </w:p>
+    <w:p>
+      <w:pPr>
+        <w:rPr>
+          <w:lang w:val="es-MX"/>
+        </w:rPr>
+      </w:pPr>
+    </w:p>
+    <w:p>
+      <w:pPr>
+        <w:pStyle w:val="Ttulo1"/>
+        <w:numPr>
+          <w:ilvl w:val="0"/>
+          <w:numId w:val="1"/>
+        </w:numPr>
+        <w:rPr>
+          <w:lang w:val="es-MX"/>
+        </w:rPr>
+      </w:pPr>
+      <w:bookmarkStart w:id="1" w:name="_Ref241232871"/>
+      <w:r>
+        <w:rPr>
+          <w:lang w:val="es-MX"/>
+        </w:rPr>
+        <w:t>Título de sección</w:t>
+      </w:r>
+      <w:bookmarkEnd w:id="1"/>
+    </w:p>
+    <w:p>
+      <w:pPr>
+        <w:rPr>
+          <w:lang w:val="es-MX"/>
+        </w:rPr>
+      </w:pPr>
+      <w:r>
+        <w:rPr>
+          <w:lang w:val="es-MX"/>
+        </w:rPr>
+        <w:t>Esta es una sección de prueba con un título</w:t>
+      </w:r>
+    </w:p>
     <w:sectPr>
       <w:pgSz w:w="11909" w:h="16834"/>
       <w:pgMar w:top="1440" w:right="1440" w:bottom="1440" w:left="1440" w:header="720" w:footer="720" w:gutter="0"/>
@@ -840,6 +1537,103 @@
     </w:sectPr>
   </w:body>
 </w:document>
+</file>
+
+<file path=word/numbering.xml><?xml version="1.0" encoding="utf-8"?>
+<w:numbering xmlns:wpc="http://schemas.microsoft.com/office/word/2010/wordprocessingCanvas" xmlns:cx="http://schemas.microsoft.com/office/drawing/2014/chartex" xmlns:cx1="http://schemas.microsoft.com/office/drawing/2015/9/8/chartex" xmlns:cx2="http://schemas.microsoft.com/office/drawing/2015/10/21/chartex" xmlns:cx3="http://schemas.microsoft.com/office/drawing/2016/5/9/chartex" xmlns:cx4="http://schemas.microsoft.com/office/drawing/2016/5/10/chartex" xmlns:cx5="http://schemas.microsoft.com/office/drawing/2016/5/11/chartex" xmlns:cx6="http://schemas.microsoft.com/office/drawing/2016/5/12/chartex" xmlns:cx7="http://schemas.microsoft.com/office/drawing/2016/5/13/chartex" xmlns:cx8="http://schemas.microsoft.com/office/drawing/2016/5/14/chartex" xmlns:mc="http://schemas.openxmlformats.org/markup-compatibility/2006" xmlns:aink="http://schemas.microsoft.com/office/drawing/2016/ink" xmlns:am3d="http://schemas.microsoft.com/office/drawing/2017/model3d" xmlns:o="urn:schemas-microsoft-com:office:office" xmlns:oel="http://schemas.microsoft.com/office/2019/extlst" xmlns:r="http://schemas.openxmlformats.org/officeDocument/2006/relationships" xmlns:m="http://schemas.openxmlformats.org/officeDocument/2006/math" xmlns:v="urn:schemas-microsoft-com:vml" xmlns:wp14="http://schemas.microsoft.com/office/word/2010/wordprocessingDrawing" xmlns:wp="http://schemas.openxmlformats.org/drawingml/2006/wordprocessingDrawing" xmlns:w10="urn:schemas-microsoft-com:office:word" xmlns:w="http://schemas.openxmlformats.org/wordprocessingml/2006/main" xmlns:w14="http://schemas.microsoft.com/office/word/2010/wordml" xmlns:w15="http://schemas.microsoft.com/office/word/2012/wordml" xmlns:w16cex="http://schemas.microsoft.com/office/word/2018/wordml/cex" xmlns:w16cid="http://schemas.microsoft.com/office/word/2016/wordml/cid" xmlns:w16="http://schemas.microsoft.com/office/word/2018/wordml" xmlns:w16du="http://schemas.microsoft.com/office/word/2023/wordml/word16du" xmlns:w16sdtdh="http://schemas.microsoft.com/office/word/2020/wordml/sdtdatahash" xmlns:w16sdtfl="http://schemas.microsoft.com/office/word/2024/wordml/sdtformatlock" xmlns:w16se="http://schemas.microsoft.com/office/word/2015/wordml/symex" xmlns:wpg="http://schemas.microsoft.com/office/word/2010/wordprocessingGroup" xmlns:wpi="http://schemas.microsoft.com/office/word/2010/wordprocessingInk" xmlns:wne="http://schemas.microsoft.com/office/word/2006/wordml" xmlns:wps="http://schemas.microsoft.com/office/word/2010/wordprocessingShape" mc:Ignorable="w14 w15 w16se w16cid w16 w16cex w16sdtdh w16sdtfl w16du wp14">
+  <w:abstractNum w:abstractNumId="0" w15:restartNumberingAfterBreak="0">
+    <w:nsid w:val="303637CC"/>
+    <w:multiLevelType w:val="hybridMultilevel"/>
+    <w:tmpl w:val="B47EF73C"/>
+    <w:lvl w:ilvl="0" w:tplc="080A000F">
+      <w:start w:val="1"/>
+      <w:numFmt w:val="decimal"/>
+      <w:lvlText w:val="%1."/>
+      <w:lvlJc w:val="left"/>
+      <w:pPr>
+        <w:ind w:left="720" w:hanging="360"/>
+      </w:pPr>
+      <w:rPr>
+        <w:rFonts w:hint="default"/>
+      </w:rPr>
+    </w:lvl>
+    <w:lvl w:ilvl="1" w:tplc="080A0019" w:tentative="1">
+      <w:start w:val="1"/>
+      <w:numFmt w:val="lowerLetter"/>
+      <w:lvlText w:val="%2."/>
+      <w:lvlJc w:val="left"/>
+      <w:pPr>
+        <w:ind w:left="1440" w:hanging="360"/>
+      </w:pPr>
+    </w:lvl>
+    <w:lvl w:ilvl="2" w:tplc="080A001B" w:tentative="1">
+      <w:start w:val="1"/>
+      <w:numFmt w:val="lowerRoman"/>
+      <w:lvlText w:val="%3."/>
+      <w:lvlJc w:val="right"/>
+      <w:pPr>
+        <w:ind w:left="2160" w:hanging="180"/>
+      </w:pPr>
+    </w:lvl>
+    <w:lvl w:ilvl="3" w:tplc="080A000F" w:tentative="1">
+      <w:start w:val="1"/>
+      <w:numFmt w:val="decimal"/>
+      <w:lvlText w:val="%4."/>
+      <w:lvlJc w:val="left"/>
+      <w:pPr>
+        <w:ind w:left="2880" w:hanging="360"/>
+      </w:pPr>
+    </w:lvl>
+    <w:lvl w:ilvl="4" w:tplc="080A0019" w:tentative="1">
+      <w:start w:val="1"/>
+      <w:numFmt w:val="lowerLetter"/>
+      <w:lvlText w:val="%5."/>
+      <w:lvlJc w:val="left"/>
+      <w:pPr>
+        <w:ind w:left="3600" w:hanging="360"/>
+      </w:pPr>
+    </w:lvl>
+    <w:lvl w:ilvl="5" w:tplc="080A001B" w:tentative="1">
+      <w:start w:val="1"/>
+      <w:numFmt w:val="lowerRoman"/>
+      <w:lvlText w:val="%6."/>
+      <w:lvlJc w:val="right"/>
+      <w:pPr>
+        <w:ind w:left="4320" w:hanging="180"/>
+      </w:pPr>
+    </w:lvl>
+    <w:lvl w:ilvl="6" w:tplc="080A000F" w:tentative="1">
+      <w:start w:val="1"/>
+      <w:numFmt w:val="decimal"/>
+      <w:lvlText w:val="%7."/>
+      <w:lvlJc w:val="left"/>
+      <w:pPr>
+        <w:ind w:left="5040" w:hanging="360"/>
+      </w:pPr>
+    </w:lvl>
+    <w:lvl w:ilvl="7" w:tplc="080A0019" w:tentative="1">
+      <w:start w:val="1"/>
+      <w:numFmt w:val="lowerLetter"/>
+      <w:lvlText w:val="%8."/>
+      <w:lvlJc w:val="left"/>
+      <w:pPr>
+        <w:ind w:left="5760" w:hanging="360"/>
+      </w:pPr>
+    </w:lvl>
+    <w:lvl w:ilvl="8" w:tplc="080A001B" w:tentative="1">
+      <w:start w:val="1"/>
+      <w:numFmt w:val="lowerRoman"/>
+      <w:lvlText w:val="%9."/>
+      <w:lvlJc w:val="right"/>
+      <w:pPr>
+        <w:ind w:left="6480" w:hanging="180"/>
+      </w:pPr>
+    </w:lvl>
+  </w:abstractNum>
+  <w:num w:numId="1" w16cid:durableId="715399435">
+    <w:abstractNumId w:val="0"/>
+  </w:num>
+</w:numbering>
 </file>
 
 <file path=word/styles.xml><?xml version="1.0" encoding="utf-8"?>

</xml_diff>